<commit_message>
Add the next implementation steps in the planning document
</commit_message>
<xml_diff>
--- a/QKI_Planung.docx
+++ b/QKI_Planung.docx
@@ -87,21 +87,12 @@
           <w:b w:val="0"/>
         </w:rPr>
       </w:pPr>
-      <w:proofErr w:type="spellStart"/>
-      <w:r>
-        <w:rPr>
-          <w:rStyle w:val="Fett"/>
-          <w:b w:val="0"/>
-        </w:rPr>
-        <w:t>Qualitätsmetriken</w:t>
-      </w:r>
-      <w:proofErr w:type="spellEnd"/>
-      <w:r>
-        <w:rPr>
-          <w:rStyle w:val="Fett"/>
-          <w:b w:val="0"/>
-        </w:rPr>
-        <w:t>: Echte Betrugsfälle (Recall-Rate), falsch erkannte Betrugsfälle (legitime Transaktionen)</w:t>
+      <w:r>
+        <w:rPr>
+          <w:rStyle w:val="Fett"/>
+          <w:b w:val="0"/>
+        </w:rPr>
+        <w:t>Qualitätsmetriken: Echte Betrugsfälle (Recall-Rate), falsch erkannte Betrugsfälle (legitime Transaktionen)</w:t>
       </w:r>
     </w:p>
     <w:p>
@@ -186,21 +177,12 @@
           <w:b w:val="0"/>
         </w:rPr>
       </w:pPr>
-      <w:proofErr w:type="spellStart"/>
-      <w:r>
-        <w:rPr>
-          <w:rStyle w:val="Fett"/>
-          <w:b w:val="0"/>
-        </w:rPr>
-        <w:t>Scope</w:t>
-      </w:r>
-      <w:proofErr w:type="spellEnd"/>
-      <w:r>
-        <w:rPr>
-          <w:rStyle w:val="Fett"/>
-          <w:b w:val="0"/>
-        </w:rPr>
-        <w:t>-Compliance</w:t>
+      <w:r>
+        <w:rPr>
+          <w:rStyle w:val="Fett"/>
+          <w:b w:val="0"/>
+        </w:rPr>
+        <w:t>Scope-Compliance</w:t>
       </w:r>
     </w:p>
     <w:p>
@@ -428,17 +410,8 @@
           <w:rStyle w:val="Fett"/>
           <w:b w:val="0"/>
         </w:rPr>
-        <w:t xml:space="preserve">AI-Act als Grundannahme </w:t>
-      </w:r>
-      <w:proofErr w:type="gramStart"/>
-      <w:r>
-        <w:rPr>
-          <w:rStyle w:val="Fett"/>
-          <w:b w:val="0"/>
-        </w:rPr>
-        <w:t>des Risiko</w:t>
-      </w:r>
-      <w:proofErr w:type="gramEnd"/>
+        <w:t>AI-Act als Grundannahme des Risiko</w:t>
+      </w:r>
     </w:p>
     <w:p>
       <w:pPr>
@@ -497,23 +470,7 @@
           <w:rStyle w:val="Fett"/>
           <w:b w:val="0"/>
         </w:rPr>
-        <w:t xml:space="preserve">Transparenz (Beispiel einer positiven und negativen Entscheidungsfindung nach der Entwicklung </w:t>
-      </w:r>
-      <w:proofErr w:type="gramStart"/>
-      <w:r>
-        <w:rPr>
-          <w:rStyle w:val="Fett"/>
-          <w:b w:val="0"/>
-        </w:rPr>
-        <w:t>von einem erklärbaren KI-Modell</w:t>
-      </w:r>
-      <w:proofErr w:type="gramEnd"/>
-      <w:r>
-        <w:rPr>
-          <w:rStyle w:val="Fett"/>
-          <w:b w:val="0"/>
-        </w:rPr>
-        <w:t>)</w:t>
+        <w:t>Transparenz (Beispiel einer positiven und negativen Entscheidungsfindung nach der Entwicklung von einem erklärbaren KI-Modell)</w:t>
       </w:r>
     </w:p>
     <w:p>
@@ -561,12 +518,14 @@
         <w:rPr>
           <w:rStyle w:val="Fett"/>
           <w:b w:val="0"/>
-        </w:rPr>
-      </w:pPr>
-      <w:r>
-        <w:rPr>
-          <w:rStyle w:val="Fett"/>
-          <w:b w:val="0"/>
+          <w:color w:val="00B050"/>
+        </w:rPr>
+      </w:pPr>
+      <w:r>
+        <w:rPr>
+          <w:rStyle w:val="Fett"/>
+          <w:b w:val="0"/>
+          <w:color w:val="00B050"/>
         </w:rPr>
         <w:t xml:space="preserve">Datensatz analysieren </w:t>
       </w:r>
@@ -574,6 +533,7 @@
         <w:rPr>
           <w:rStyle w:val="Fett"/>
           <w:b w:val="0"/>
+          <w:color w:val="00B050"/>
         </w:rPr>
         <w:sym w:font="Wingdings" w:char="F0E0"/>
       </w:r>
@@ -581,6 +541,7 @@
         <w:rPr>
           <w:rStyle w:val="Fett"/>
           <w:b w:val="0"/>
+          <w:color w:val="00B050"/>
         </w:rPr>
         <w:t xml:space="preserve"> Grundstein für die Qualitätssicherung</w:t>
       </w:r>
@@ -595,30 +556,16 @@
         <w:rPr>
           <w:rStyle w:val="Fett"/>
           <w:b w:val="0"/>
-        </w:rPr>
-      </w:pPr>
-      <w:r>
-        <w:rPr>
-          <w:rStyle w:val="Fett"/>
-          <w:b w:val="0"/>
-        </w:rPr>
-        <w:t>Datenqualität und Risikoanalyse (Verfügbarkeit (</w:t>
-      </w:r>
-      <w:proofErr w:type="spellStart"/>
-      <w:r>
-        <w:rPr>
-          <w:rStyle w:val="Fett"/>
-          <w:b w:val="0"/>
-        </w:rPr>
-        <w:t>Scope</w:t>
-      </w:r>
-      <w:proofErr w:type="spellEnd"/>
-      <w:r>
-        <w:rPr>
-          <w:rStyle w:val="Fett"/>
-          <w:b w:val="0"/>
-        </w:rPr>
-        <w:t>-Compliance), fehlende Werte, Bias &amp; Fairness, Ungleichgewichte)</w:t>
+          <w:color w:val="00B050"/>
+        </w:rPr>
+      </w:pPr>
+      <w:r>
+        <w:rPr>
+          <w:rStyle w:val="Fett"/>
+          <w:b w:val="0"/>
+          <w:color w:val="00B050"/>
+        </w:rPr>
+        <w:t>Datenqualität und Risikoanalyse (Verfügbarkeit (Scope-Compliance), fehlende Werte, Bias &amp; Fairness, Ungleichgewichte)</w:t>
       </w:r>
     </w:p>
     <w:p>
@@ -631,12 +578,14 @@
         <w:rPr>
           <w:rStyle w:val="Fett"/>
           <w:b w:val="0"/>
-        </w:rPr>
-      </w:pPr>
-      <w:r>
-        <w:rPr>
-          <w:rStyle w:val="Fett"/>
-          <w:b w:val="0"/>
+          <w:color w:val="00B050"/>
+        </w:rPr>
+      </w:pPr>
+      <w:r>
+        <w:rPr>
+          <w:rStyle w:val="Fett"/>
+          <w:b w:val="0"/>
+          <w:color w:val="00B050"/>
         </w:rPr>
         <w:t>Datenvorverarbeitung auf Basis der Analyse</w:t>
       </w:r>
@@ -651,26 +600,22 @@
         <w:rPr>
           <w:rStyle w:val="Fett"/>
           <w:b w:val="0"/>
-        </w:rPr>
-      </w:pPr>
-      <w:r>
-        <w:rPr>
-          <w:rStyle w:val="Fett"/>
-          <w:b w:val="0"/>
-        </w:rPr>
-        <w:t>Feature Engineering (Sinnvolle Features die für die B</w:t>
-      </w:r>
-      <w:r>
-        <w:rPr>
-          <w:rStyle w:val="Fett"/>
-          <w:b w:val="0"/>
-        </w:rPr>
-        <w:t xml:space="preserve">etrachtung bei der Erkennung von Betrug wichtig sein könnten </w:t>
-      </w:r>
-      <w:r>
-        <w:rPr>
-          <w:rStyle w:val="Fett"/>
-          <w:b w:val="0"/>
+          <w:color w:val="00B050"/>
+        </w:rPr>
+      </w:pPr>
+      <w:r>
+        <w:rPr>
+          <w:rStyle w:val="Fett"/>
+          <w:b w:val="0"/>
+          <w:color w:val="00B050"/>
+        </w:rPr>
+        <w:t xml:space="preserve">Feature Engineering (Sinnvolle Features die für die Betrachtung bei der Erkennung von Betrug wichtig sein könnten </w:t>
+      </w:r>
+      <w:r>
+        <w:rPr>
+          <w:rStyle w:val="Fett"/>
+          <w:b w:val="0"/>
+          <w:color w:val="00B050"/>
         </w:rPr>
         <w:sym w:font="Wingdings" w:char="F0E0"/>
       </w:r>
@@ -678,6 +623,7 @@
         <w:rPr>
           <w:rStyle w:val="Fett"/>
           <w:b w:val="0"/>
+          <w:color w:val="00B050"/>
         </w:rPr>
         <w:t xml:space="preserve"> ggf. Überweisungen in den letzten 24 Stunden, etc.)</w:t>
       </w:r>
@@ -692,12 +638,14 @@
         <w:rPr>
           <w:rStyle w:val="Fett"/>
           <w:b w:val="0"/>
-        </w:rPr>
-      </w:pPr>
-      <w:r>
-        <w:rPr>
-          <w:rStyle w:val="Fett"/>
-          <w:b w:val="0"/>
+          <w:color w:val="00B050"/>
+        </w:rPr>
+      </w:pPr>
+      <w:r>
+        <w:rPr>
+          <w:rStyle w:val="Fett"/>
+          <w:b w:val="0"/>
+          <w:color w:val="00B050"/>
         </w:rPr>
         <w:t>Datenaufteilung in Trainings-, Validierungs- und Testdaten</w:t>
       </w:r>
@@ -719,33 +667,8 @@
           <w:rStyle w:val="Fett"/>
           <w:b w:val="0"/>
         </w:rPr>
-        <w:t xml:space="preserve">Definition von Qualitäts- und </w:t>
-      </w:r>
-      <w:proofErr w:type="spellStart"/>
-      <w:r>
-        <w:rPr>
-          <w:rStyle w:val="Fett"/>
-          <w:b w:val="0"/>
-        </w:rPr>
-        <w:t>Validierungsmetriken</w:t>
-      </w:r>
-      <w:proofErr w:type="spellEnd"/>
-      <w:r>
-        <w:rPr>
-          <w:rStyle w:val="Fett"/>
-          <w:b w:val="0"/>
-        </w:rPr>
-        <w:t xml:space="preserve"> (z. B. Precision, Recall, F1, </w:t>
-      </w:r>
-      <w:proofErr w:type="spellStart"/>
-      <w:r>
-        <w:rPr>
-          <w:rStyle w:val="Fett"/>
-          <w:b w:val="0"/>
-        </w:rPr>
-        <w:t>etc</w:t>
-      </w:r>
-      <w:proofErr w:type="spellEnd"/>
+        <w:t>Definition von Qualitäts- und Validierungsmetriken (z. B. Precision, Recall, F1, etc</w:t>
+      </w:r>
     </w:p>
     <w:p>
       <w:pPr>
@@ -798,6 +721,66 @@
       <w:pPr>
         <w:pStyle w:val="Listenabsatz"/>
         <w:numPr>
+          <w:ilvl w:val="1"/>
+          <w:numId w:val="6"/>
+        </w:numPr>
+        <w:rPr>
+          <w:rStyle w:val="Fett"/>
+          <w:b w:val="0"/>
+        </w:rPr>
+      </w:pPr>
+      <w:r>
+        <w:rPr>
+          <w:rStyle w:val="Fett"/>
+          <w:b w:val="0"/>
+        </w:rPr>
+        <w:t>DBSCAN / K-Means (Celina)</w:t>
+      </w:r>
+    </w:p>
+    <w:p>
+      <w:pPr>
+        <w:pStyle w:val="Listenabsatz"/>
+        <w:numPr>
+          <w:ilvl w:val="1"/>
+          <w:numId w:val="6"/>
+        </w:numPr>
+        <w:rPr>
+          <w:rStyle w:val="Fett"/>
+          <w:b w:val="0"/>
+        </w:rPr>
+      </w:pPr>
+      <w:r>
+        <w:rPr>
+          <w:rStyle w:val="Fett"/>
+          <w:b w:val="0"/>
+        </w:rPr>
+        <w:t>Neuronales Netzwerk (Enzo)</w:t>
+      </w:r>
+    </w:p>
+    <w:p>
+      <w:pPr>
+        <w:pStyle w:val="Listenabsatz"/>
+        <w:numPr>
+          <w:ilvl w:val="1"/>
+          <w:numId w:val="6"/>
+        </w:numPr>
+        <w:rPr>
+          <w:rStyle w:val="Fett"/>
+          <w:b w:val="0"/>
+        </w:rPr>
+      </w:pPr>
+      <w:r>
+        <w:rPr>
+          <w:rStyle w:val="Fett"/>
+          <w:b w:val="0"/>
+        </w:rPr>
+        <w:t>SHAP (Enzo) / LIME (Celina)</w:t>
+      </w:r>
+    </w:p>
+    <w:p>
+      <w:pPr>
+        <w:pStyle w:val="Listenabsatz"/>
+        <w:numPr>
           <w:ilvl w:val="0"/>
           <w:numId w:val="6"/>
         </w:numPr>
@@ -811,55 +794,7 @@
           <w:rStyle w:val="Fett"/>
           <w:b w:val="0"/>
         </w:rPr>
-        <w:t>Adressierung von Corner Cases (</w:t>
-      </w:r>
-      <w:proofErr w:type="gramStart"/>
-      <w:r>
-        <w:rPr>
-          <w:rStyle w:val="Fett"/>
-          <w:b w:val="0"/>
-        </w:rPr>
-        <w:t>Hier</w:t>
-      </w:r>
-      <w:proofErr w:type="gramEnd"/>
-      <w:r>
-        <w:rPr>
-          <w:rStyle w:val="Fett"/>
-          <w:b w:val="0"/>
-        </w:rPr>
-        <w:t xml:space="preserve"> dann die Ausnahmesituationen beschreiben, wie beispielsweise </w:t>
-      </w:r>
-      <w:proofErr w:type="gramStart"/>
-      <w:r>
-        <w:rPr>
-          <w:rStyle w:val="Fett"/>
-          <w:b w:val="0"/>
-        </w:rPr>
-        <w:t>extrem große</w:t>
-      </w:r>
-      <w:proofErr w:type="gramEnd"/>
-      <w:r>
-        <w:rPr>
-          <w:rStyle w:val="Fett"/>
-          <w:b w:val="0"/>
-        </w:rPr>
-        <w:t xml:space="preserve"> oder </w:t>
-      </w:r>
-      <w:proofErr w:type="gramStart"/>
-      <w:r>
-        <w:rPr>
-          <w:rStyle w:val="Fett"/>
-          <w:b w:val="0"/>
-        </w:rPr>
-        <w:t>extrem kleine</w:t>
-      </w:r>
-      <w:proofErr w:type="gramEnd"/>
-      <w:r>
-        <w:rPr>
-          <w:rStyle w:val="Fett"/>
-          <w:b w:val="0"/>
-        </w:rPr>
-        <w:t xml:space="preserve"> Werte Einfluss haben und dann auch mal durch die Modelle jagen und testen, ob das Ergebnis diese erkennt)</w:t>
+        <w:t>Adressierung von Corner Cases (Hier dann die Ausnahmesituationen beschreiben, wie beispielsweise extrem große oder extrem kleine Werte Einfluss haben und dann auch mal durch die Modelle jagen und testen, ob das Ergebnis diese erkennt)</w:t>
       </w:r>
     </w:p>
     <w:p>
@@ -879,6 +814,7 @@
           <w:rStyle w:val="Fett"/>
           <w:b w:val="0"/>
         </w:rPr>
+        <w:lastRenderedPageBreak/>
         <w:t>Implementierung der Erklärbarkeit (SHAP, LIME, etc. als Verfahren verwenden und dann mal schauen, welche Einflussfaktoren zu einer positiven oder negativen Entscheidung führen)</w:t>
       </w:r>
     </w:p>
@@ -1020,7 +956,7 @@
         <w:ind w:left="720" w:hanging="360"/>
       </w:pPr>
     </w:lvl>
-    <w:lvl w:ilvl="1" w:tplc="04070019" w:tentative="1">
+    <w:lvl w:ilvl="1" w:tplc="04070019">
       <w:start w:val="1"/>
       <w:numFmt w:val="lowerLetter"/>
       <w:lvlText w:val="%2."/>

</xml_diff>

<commit_message>
Change the planning doucment
</commit_message>
<xml_diff>
--- a/QKI_Planung.docx
+++ b/QKI_Planung.docx
@@ -87,12 +87,21 @@
           <w:b w:val="0"/>
         </w:rPr>
       </w:pPr>
-      <w:r>
-        <w:rPr>
-          <w:rStyle w:val="Fett"/>
-          <w:b w:val="0"/>
-        </w:rPr>
-        <w:t>Qualitätsmetriken: Echte Betrugsfälle (Recall-Rate), falsch erkannte Betrugsfälle (legitime Transaktionen)</w:t>
+      <w:proofErr w:type="spellStart"/>
+      <w:r>
+        <w:rPr>
+          <w:rStyle w:val="Fett"/>
+          <w:b w:val="0"/>
+        </w:rPr>
+        <w:t>Qualitätsmetriken</w:t>
+      </w:r>
+      <w:proofErr w:type="spellEnd"/>
+      <w:r>
+        <w:rPr>
+          <w:rStyle w:val="Fett"/>
+          <w:b w:val="0"/>
+        </w:rPr>
+        <w:t>: Echte Betrugsfälle (Recall-Rate), falsch erkannte Betrugsfälle (legitime Transaktionen)</w:t>
       </w:r>
     </w:p>
     <w:p>
@@ -177,12 +186,21 @@
           <w:b w:val="0"/>
         </w:rPr>
       </w:pPr>
-      <w:r>
-        <w:rPr>
-          <w:rStyle w:val="Fett"/>
-          <w:b w:val="0"/>
-        </w:rPr>
-        <w:t>Scope-Compliance</w:t>
+      <w:proofErr w:type="spellStart"/>
+      <w:r>
+        <w:rPr>
+          <w:rStyle w:val="Fett"/>
+          <w:b w:val="0"/>
+        </w:rPr>
+        <w:t>Scope</w:t>
+      </w:r>
+      <w:proofErr w:type="spellEnd"/>
+      <w:r>
+        <w:rPr>
+          <w:rStyle w:val="Fett"/>
+          <w:b w:val="0"/>
+        </w:rPr>
+        <w:t>-Compliance</w:t>
       </w:r>
     </w:p>
     <w:p>
@@ -410,8 +428,17 @@
           <w:rStyle w:val="Fett"/>
           <w:b w:val="0"/>
         </w:rPr>
-        <w:t>AI-Act als Grundannahme des Risiko</w:t>
-      </w:r>
+        <w:t xml:space="preserve">AI-Act als Grundannahme </w:t>
+      </w:r>
+      <w:proofErr w:type="gramStart"/>
+      <w:r>
+        <w:rPr>
+          <w:rStyle w:val="Fett"/>
+          <w:b w:val="0"/>
+        </w:rPr>
+        <w:t>des Risiko</w:t>
+      </w:r>
+      <w:proofErr w:type="gramEnd"/>
     </w:p>
     <w:p>
       <w:pPr>
@@ -470,7 +497,23 @@
           <w:rStyle w:val="Fett"/>
           <w:b w:val="0"/>
         </w:rPr>
-        <w:t>Transparenz (Beispiel einer positiven und negativen Entscheidungsfindung nach der Entwicklung von einem erklärbaren KI-Modell)</w:t>
+        <w:t xml:space="preserve">Transparenz (Beispiel einer positiven und negativen Entscheidungsfindung nach der Entwicklung </w:t>
+      </w:r>
+      <w:proofErr w:type="gramStart"/>
+      <w:r>
+        <w:rPr>
+          <w:rStyle w:val="Fett"/>
+          <w:b w:val="0"/>
+        </w:rPr>
+        <w:t>von einem erklärbaren KI-Modell</w:t>
+      </w:r>
+      <w:proofErr w:type="gramEnd"/>
+      <w:r>
+        <w:rPr>
+          <w:rStyle w:val="Fett"/>
+          <w:b w:val="0"/>
+        </w:rPr>
+        <w:t>)</w:t>
       </w:r>
     </w:p>
     <w:p>
@@ -565,7 +608,25 @@
           <w:b w:val="0"/>
           <w:color w:val="00B050"/>
         </w:rPr>
-        <w:t>Datenqualität und Risikoanalyse (Verfügbarkeit (Scope-Compliance), fehlende Werte, Bias &amp; Fairness, Ungleichgewichte)</w:t>
+        <w:t>Datenqualität und Risikoanalyse (Verfügbarkeit (</w:t>
+      </w:r>
+      <w:proofErr w:type="spellStart"/>
+      <w:r>
+        <w:rPr>
+          <w:rStyle w:val="Fett"/>
+          <w:b w:val="0"/>
+          <w:color w:val="00B050"/>
+        </w:rPr>
+        <w:t>Scope</w:t>
+      </w:r>
+      <w:proofErr w:type="spellEnd"/>
+      <w:r>
+        <w:rPr>
+          <w:rStyle w:val="Fett"/>
+          <w:b w:val="0"/>
+          <w:color w:val="00B050"/>
+        </w:rPr>
+        <w:t>-Compliance), fehlende Werte, Bias &amp; Fairness, Ungleichgewichte)</w:t>
       </w:r>
     </w:p>
     <w:p>
@@ -667,8 +728,33 @@
           <w:rStyle w:val="Fett"/>
           <w:b w:val="0"/>
         </w:rPr>
-        <w:t>Definition von Qualitäts- und Validierungsmetriken (z. B. Precision, Recall, F1, etc</w:t>
-      </w:r>
+        <w:t xml:space="preserve">Definition von Qualitäts- und </w:t>
+      </w:r>
+      <w:proofErr w:type="spellStart"/>
+      <w:r>
+        <w:rPr>
+          <w:rStyle w:val="Fett"/>
+          <w:b w:val="0"/>
+        </w:rPr>
+        <w:t>Validierungsmetriken</w:t>
+      </w:r>
+      <w:proofErr w:type="spellEnd"/>
+      <w:r>
+        <w:rPr>
+          <w:rStyle w:val="Fett"/>
+          <w:b w:val="0"/>
+        </w:rPr>
+        <w:t xml:space="preserve"> (z. B. Precision, Recall, F1, </w:t>
+      </w:r>
+      <w:proofErr w:type="spellStart"/>
+      <w:r>
+        <w:rPr>
+          <w:rStyle w:val="Fett"/>
+          <w:b w:val="0"/>
+        </w:rPr>
+        <w:t>etc</w:t>
+      </w:r>
+      <w:proofErr w:type="spellEnd"/>
     </w:p>
     <w:p>
       <w:pPr>
@@ -734,7 +820,23 @@
           <w:rStyle w:val="Fett"/>
           <w:b w:val="0"/>
         </w:rPr>
-        <w:t>DBSCAN / K-Means (Celina)</w:t>
+        <w:t>DBSCAN / K-</w:t>
+      </w:r>
+      <w:proofErr w:type="spellStart"/>
+      <w:r>
+        <w:rPr>
+          <w:rStyle w:val="Fett"/>
+          <w:b w:val="0"/>
+        </w:rPr>
+        <w:t>Means</w:t>
+      </w:r>
+      <w:proofErr w:type="spellEnd"/>
+      <w:r>
+        <w:rPr>
+          <w:rStyle w:val="Fett"/>
+          <w:b w:val="0"/>
+        </w:rPr>
+        <w:t xml:space="preserve"> (Celina)</w:t>
       </w:r>
     </w:p>
     <w:p>
@@ -781,6 +883,74 @@
       <w:pPr>
         <w:pStyle w:val="Listenabsatz"/>
         <w:numPr>
+          <w:ilvl w:val="2"/>
+          <w:numId w:val="6"/>
+        </w:numPr>
+        <w:rPr>
+          <w:rStyle w:val="Fett"/>
+          <w:b w:val="0"/>
+        </w:rPr>
+      </w:pPr>
+      <w:r>
+        <w:rPr>
+          <w:rStyle w:val="Fett"/>
+          <w:b w:val="0"/>
+        </w:rPr>
+        <w:t>Korrekt klassifizierte Daten extrahieren (die paar Prozent)</w:t>
+      </w:r>
+    </w:p>
+    <w:p>
+      <w:pPr>
+        <w:pStyle w:val="Listenabsatz"/>
+        <w:numPr>
+          <w:ilvl w:val="2"/>
+          <w:numId w:val="6"/>
+        </w:numPr>
+        <w:rPr>
+          <w:rStyle w:val="Fett"/>
+          <w:b w:val="0"/>
+        </w:rPr>
+      </w:pPr>
+      <w:r>
+        <w:rPr>
+          <w:rStyle w:val="Fett"/>
+          <w:b w:val="0"/>
+        </w:rPr>
+        <w:t xml:space="preserve">Auf Basis dessen SHAP anwenden </w:t>
+      </w:r>
+      <w:r>
+        <w:rPr>
+          <w:rStyle w:val="Fett"/>
+          <w:b w:val="0"/>
+        </w:rPr>
+        <w:sym w:font="Wingdings" w:char="F0E0"/>
+      </w:r>
+      <w:r>
+        <w:rPr>
+          <w:rStyle w:val="Fett"/>
+          <w:b w:val="0"/>
+        </w:rPr>
+        <w:t xml:space="preserve"> Wie kommt das Modell zur Entscheidung </w:t>
+      </w:r>
+      <w:r>
+        <w:rPr>
+          <w:rStyle w:val="Fett"/>
+          <w:b w:val="0"/>
+        </w:rPr>
+        <w:sym w:font="Wingdings" w:char="F0E0"/>
+      </w:r>
+      <w:r>
+        <w:rPr>
+          <w:rStyle w:val="Fett"/>
+          <w:b w:val="0"/>
+        </w:rPr>
+        <w:t xml:space="preserve"> weitere Verfahren testen</w:t>
+      </w:r>
+    </w:p>
+    <w:p>
+      <w:pPr>
+        <w:pStyle w:val="Listenabsatz"/>
+        <w:numPr>
           <w:ilvl w:val="0"/>
           <w:numId w:val="6"/>
         </w:numPr>
@@ -794,7 +964,56 @@
           <w:rStyle w:val="Fett"/>
           <w:b w:val="0"/>
         </w:rPr>
-        <w:t>Adressierung von Corner Cases (Hier dann die Ausnahmesituationen beschreiben, wie beispielsweise extrem große oder extrem kleine Werte Einfluss haben und dann auch mal durch die Modelle jagen und testen, ob das Ergebnis diese erkennt)</w:t>
+        <w:lastRenderedPageBreak/>
+        <w:t>Adressierung von Corner Cases (</w:t>
+      </w:r>
+      <w:proofErr w:type="gramStart"/>
+      <w:r>
+        <w:rPr>
+          <w:rStyle w:val="Fett"/>
+          <w:b w:val="0"/>
+        </w:rPr>
+        <w:t>Hier</w:t>
+      </w:r>
+      <w:proofErr w:type="gramEnd"/>
+      <w:r>
+        <w:rPr>
+          <w:rStyle w:val="Fett"/>
+          <w:b w:val="0"/>
+        </w:rPr>
+        <w:t xml:space="preserve"> dann die Ausnahmesituationen beschreiben, wie beispielsweise </w:t>
+      </w:r>
+      <w:proofErr w:type="gramStart"/>
+      <w:r>
+        <w:rPr>
+          <w:rStyle w:val="Fett"/>
+          <w:b w:val="0"/>
+        </w:rPr>
+        <w:t>extrem große</w:t>
+      </w:r>
+      <w:proofErr w:type="gramEnd"/>
+      <w:r>
+        <w:rPr>
+          <w:rStyle w:val="Fett"/>
+          <w:b w:val="0"/>
+        </w:rPr>
+        <w:t xml:space="preserve"> oder </w:t>
+      </w:r>
+      <w:proofErr w:type="gramStart"/>
+      <w:r>
+        <w:rPr>
+          <w:rStyle w:val="Fett"/>
+          <w:b w:val="0"/>
+        </w:rPr>
+        <w:t>extrem kleine</w:t>
+      </w:r>
+      <w:proofErr w:type="gramEnd"/>
+      <w:r>
+        <w:rPr>
+          <w:rStyle w:val="Fett"/>
+          <w:b w:val="0"/>
+        </w:rPr>
+        <w:t xml:space="preserve"> Werte Einfluss haben und dann auch mal durch die Modelle jagen und testen, ob das Ergebnis diese erkennt)</w:t>
       </w:r>
     </w:p>
     <w:p>
@@ -814,7 +1033,6 @@
           <w:rStyle w:val="Fett"/>
           <w:b w:val="0"/>
         </w:rPr>
-        <w:lastRenderedPageBreak/>
         <w:t>Implementierung der Erklärbarkeit (SHAP, LIME, etc. als Verfahren verwenden und dann mal schauen, welche Einflussfaktoren zu einer positiven oder negativen Entscheidung führen)</w:t>
       </w:r>
     </w:p>
@@ -965,7 +1183,7 @@
         <w:ind w:left="1440" w:hanging="360"/>
       </w:pPr>
     </w:lvl>
-    <w:lvl w:ilvl="2" w:tplc="0407001B" w:tentative="1">
+    <w:lvl w:ilvl="2" w:tplc="0407001B">
       <w:start w:val="1"/>
       <w:numFmt w:val="lowerRoman"/>
       <w:lvlText w:val="%3."/>

</xml_diff>